<commit_message>
basic of lab 2
</commit_message>
<xml_diff>
--- a/lab2/docs/P3321 ТПО ЛР2 Фам Данг Чунг Нгиа.docx
+++ b/lab2/docs/P3321 ТПО ЛР2 Фам Данг Чунг Нгиа.docx
@@ -570,15 +570,7 @@
           <w:sz w:val="28"/>
           <w:szCs w:val="28"/>
         </w:rPr>
-        <w:t>Правила выполне</w:t>
-      </w:r>
-      <w:r>
-        <w:rPr>
-          <w:rFonts w:ascii="Times New Roman" w:hAnsi="Times New Roman" w:cs="Times New Roman"/>
-          <w:sz w:val="28"/>
-          <w:szCs w:val="28"/>
-        </w:rPr>
-        <w:t>ния работы:</w:t>
+        <w:t>Правила выполнения работы:</w:t>
       </w:r>
     </w:p>
     <w:p>
@@ -1072,6 +1064,7 @@
       <w:r>
         <w:rPr>
           <w:rFonts w:ascii="Times New Roman" w:eastAsia="Times New Roman" w:hAnsi="Times New Roman" w:cs="Times New Roman"/>
+          <w:noProof/>
           <w:sz w:val="32"/>
           <w:szCs w:val="32"/>
           <w:lang w:val="en-US"/>
@@ -1130,25 +1123,7 @@
             <w:szCs w:val="28"/>
             <w:lang w:val="en-US"/>
           </w:rPr>
-          <w:t>https://github.com/nghiaphamhb/Soft</w:t>
-        </w:r>
-        <w:r>
-          <w:rPr>
-            <w:rStyle w:val="Hyperlink"/>
-            <w:sz w:val="28"/>
-            <w:szCs w:val="28"/>
-            <w:lang w:val="en-US"/>
-          </w:rPr>
-          <w:t>w</w:t>
-        </w:r>
-        <w:r>
-          <w:rPr>
-            <w:rStyle w:val="Hyperlink"/>
-            <w:sz w:val="28"/>
-            <w:szCs w:val="28"/>
-            <w:lang w:val="en-US"/>
-          </w:rPr>
-          <w:t>are-Testing/tree/main/lab2</w:t>
+          <w:t>https://github.com/nghiaphamhb/Software-Testing/tree/main/lab2</w:t>
         </w:r>
       </w:hyperlink>
     </w:p>
@@ -1164,22 +1139,19 @@
         </w:rPr>
       </w:pPr>
       <w:r>
-        <w:rPr>
-          <w:noProof/>
-        </w:rPr>
         <w:drawing>
-          <wp:anchor distT="0" distB="0" distL="114300" distR="114300" simplePos="0" relativeHeight="251661312" behindDoc="0" locked="0" layoutInCell="1" allowOverlap="1" wp14:anchorId="03862ADA" wp14:editId="4D26A9F6">
+          <wp:anchor distT="0" distB="0" distL="114300" distR="114300" simplePos="0" relativeHeight="251664384" behindDoc="0" locked="0" layoutInCell="1" allowOverlap="1" wp14:anchorId="219C563D" wp14:editId="05A51770">
             <wp:simplePos x="0" y="0"/>
             <wp:positionH relativeFrom="column">
-              <wp:posOffset>-485775</wp:posOffset>
+              <wp:posOffset>-690880</wp:posOffset>
             </wp:positionH>
             <wp:positionV relativeFrom="paragraph">
-              <wp:posOffset>508635</wp:posOffset>
+              <wp:posOffset>459105</wp:posOffset>
             </wp:positionV>
-            <wp:extent cx="6518275" cy="1508760"/>
+            <wp:extent cx="6630670" cy="1031875"/>
             <wp:effectExtent l="0" t="0" r="0" b="0"/>
             <wp:wrapTopAndBottom/>
-            <wp:docPr id="9" name="Picture 9"/>
+            <wp:docPr id="2" name="Picture 2"/>
             <wp:cNvGraphicFramePr>
               <a:graphicFrameLocks xmlns:a="http://schemas.openxmlformats.org/drawingml/2006/main" noChangeAspect="1"/>
             </wp:cNvGraphicFramePr>
@@ -1187,7 +1159,7 @@
               <a:graphicData uri="http://schemas.openxmlformats.org/drawingml/2006/picture">
                 <pic:pic xmlns:pic="http://schemas.openxmlformats.org/drawingml/2006/picture">
                   <pic:nvPicPr>
-                    <pic:cNvPr id="9" name="UML_diagram_program.png"/>
+                    <pic:cNvPr id="1" name=""/>
                     <pic:cNvPicPr/>
                   </pic:nvPicPr>
                   <pic:blipFill>
@@ -1205,7 +1177,7 @@
                   <pic:spPr>
                     <a:xfrm>
                       <a:off x="0" y="0"/>
-                      <a:ext cx="6518275" cy="1508760"/>
+                      <a:ext cx="6630670" cy="1031875"/>
                     </a:xfrm>
                     <a:prstGeom prst="rect">
                       <a:avLst/>
@@ -1238,6 +1210,9 @@
     <w:p>
       <w:pPr>
         <w:pStyle w:val="NormalWeb"/>
+        <w:rPr>
+          <w:lang w:val="ru-RU"/>
+        </w:rPr>
       </w:pPr>
     </w:p>
     <w:p>
@@ -2815,18 +2790,39 @@
           <w:sz w:val="36"/>
           <w:szCs w:val="36"/>
         </w:rPr>
+        <w:t>Отчеты тестового покрытия</w:t>
+      </w:r>
+      <w:r>
+        <w:rPr>
+          <w:rFonts w:ascii="Times New Roman" w:eastAsia="Times New Roman" w:hAnsi="Times New Roman" w:cs="Times New Roman"/>
+          <w:b/>
+          <w:sz w:val="36"/>
+          <w:szCs w:val="36"/>
+        </w:rPr>
+        <w:t xml:space="preserve"> </w:t>
+      </w:r>
+    </w:p>
+    <w:p>
+      <w:pPr>
+        <w:ind w:left="-360"/>
+        <w:rPr>
+          <w:rFonts w:ascii="Times New Roman" w:eastAsia="Times New Roman" w:hAnsi="Times New Roman" w:cs="Times New Roman"/>
+          <w:b/>
+          <w:sz w:val="36"/>
+          <w:szCs w:val="36"/>
+        </w:rPr>
+      </w:pPr>
+      <w:r>
+        <w:rPr>
+          <w:rFonts w:ascii="Times New Roman" w:eastAsia="Times New Roman" w:hAnsi="Times New Roman" w:cs="Times New Roman"/>
+          <w:b/>
+          <w:sz w:val="36"/>
+          <w:szCs w:val="36"/>
+        </w:rPr>
         <w:drawing>
-          <wp:anchor distT="0" distB="0" distL="114300" distR="114300" simplePos="0" relativeHeight="251662336" behindDoc="0" locked="0" layoutInCell="1" allowOverlap="1" wp14:anchorId="35EC4DE3" wp14:editId="4574CB2A">
-            <wp:simplePos x="0" y="0"/>
-            <wp:positionH relativeFrom="column">
-              <wp:posOffset>-280035</wp:posOffset>
-            </wp:positionH>
-            <wp:positionV relativeFrom="paragraph">
-              <wp:posOffset>484505</wp:posOffset>
-            </wp:positionV>
-            <wp:extent cx="6517005" cy="1325880"/>
-            <wp:effectExtent l="0" t="0" r="0" b="7620"/>
-            <wp:wrapTopAndBottom/>
+          <wp:inline distT="0" distB="0" distL="0" distR="0" wp14:anchorId="0DBCFD38" wp14:editId="5D72F1C4">
+            <wp:extent cx="6221396" cy="1267691"/>
+            <wp:effectExtent l="0" t="0" r="8255" b="8890"/>
             <wp:docPr id="1" name="Picture 1"/>
             <wp:cNvGraphicFramePr>
               <a:graphicFrameLocks xmlns:a="http://schemas.openxmlformats.org/drawingml/2006/main" noChangeAspect="1"/>
@@ -2839,13 +2835,7 @@
                     <pic:cNvPicPr/>
                   </pic:nvPicPr>
                   <pic:blipFill>
-                    <a:blip r:embed="rId12" cstate="print">
-                      <a:extLst>
-                        <a:ext uri="{28A0092B-C50C-407E-A947-70E740481C1C}">
-                          <a14:useLocalDpi xmlns:a14="http://schemas.microsoft.com/office/drawing/2010/main" val="0"/>
-                        </a:ext>
-                      </a:extLst>
-                    </a:blip>
+                    <a:blip r:embed="rId12"/>
                     <a:stretch>
                       <a:fillRect/>
                     </a:stretch>
@@ -2853,7 +2843,7 @@
                   <pic:spPr>
                     <a:xfrm>
                       <a:off x="0" y="0"/>
-                      <a:ext cx="6517005" cy="1325880"/>
+                      <a:ext cx="6247510" cy="1273012"/>
                     </a:xfrm>
                     <a:prstGeom prst="rect">
                       <a:avLst/>
@@ -2862,32 +2852,8 @@
                 </pic:pic>
               </a:graphicData>
             </a:graphic>
-            <wp14:sizeRelH relativeFrom="margin">
-              <wp14:pctWidth>0</wp14:pctWidth>
-            </wp14:sizeRelH>
-            <wp14:sizeRelV relativeFrom="margin">
-              <wp14:pctHeight>0</wp14:pctHeight>
-            </wp14:sizeRelV>
-          </wp:anchor>
+          </wp:inline>
         </w:drawing>
-      </w:r>
-      <w:r>
-        <w:rPr>
-          <w:rFonts w:ascii="Times New Roman" w:eastAsia="Times New Roman" w:hAnsi="Times New Roman" w:cs="Times New Roman"/>
-          <w:b/>
-          <w:sz w:val="36"/>
-          <w:szCs w:val="36"/>
-        </w:rPr>
-        <w:t>Отчеты тестового покрытия</w:t>
-      </w:r>
-      <w:r>
-        <w:rPr>
-          <w:rFonts w:ascii="Times New Roman" w:eastAsia="Times New Roman" w:hAnsi="Times New Roman" w:cs="Times New Roman"/>
-          <w:b/>
-          <w:sz w:val="36"/>
-          <w:szCs w:val="36"/>
-        </w:rPr>
-        <w:t xml:space="preserve"> </w:t>
       </w:r>
     </w:p>
     <w:p>
@@ -2937,18 +2903,10 @@
           <w:szCs w:val="28"/>
         </w:rPr>
         <w:drawing>
-          <wp:anchor distT="0" distB="0" distL="114300" distR="114300" simplePos="0" relativeHeight="251663360" behindDoc="0" locked="0" layoutInCell="1" allowOverlap="1" wp14:anchorId="31FE729B" wp14:editId="097F6D4B">
-            <wp:simplePos x="0" y="0"/>
-            <wp:positionH relativeFrom="column">
-              <wp:posOffset>1905</wp:posOffset>
-            </wp:positionH>
-            <wp:positionV relativeFrom="paragraph">
-              <wp:posOffset>-2540</wp:posOffset>
-            </wp:positionV>
-            <wp:extent cx="5939790" cy="1304290"/>
-            <wp:effectExtent l="0" t="0" r="3810" b="0"/>
-            <wp:wrapTopAndBottom/>
-            <wp:docPr id="13" name="Picture 13"/>
+          <wp:inline distT="0" distB="0" distL="0" distR="0" wp14:anchorId="70A187B6" wp14:editId="07090EC5">
+            <wp:extent cx="6267258" cy="1205345"/>
+            <wp:effectExtent l="0" t="0" r="635" b="0"/>
+            <wp:docPr id="5" name="Picture 5"/>
             <wp:cNvGraphicFramePr>
               <a:graphicFrameLocks xmlns:a="http://schemas.openxmlformats.org/drawingml/2006/main" noChangeAspect="1"/>
             </wp:cNvGraphicFramePr>
@@ -2960,13 +2918,7 @@
                     <pic:cNvPicPr/>
                   </pic:nvPicPr>
                   <pic:blipFill>
-                    <a:blip r:embed="rId13">
-                      <a:extLst>
-                        <a:ext uri="{28A0092B-C50C-407E-A947-70E740481C1C}">
-                          <a14:useLocalDpi xmlns:a14="http://schemas.microsoft.com/office/drawing/2010/main" val="0"/>
-                        </a:ext>
-                      </a:extLst>
-                    </a:blip>
+                    <a:blip r:embed="rId13"/>
                     <a:stretch>
                       <a:fillRect/>
                     </a:stretch>
@@ -2974,7 +2926,7 @@
                   <pic:spPr>
                     <a:xfrm>
                       <a:off x="0" y="0"/>
-                      <a:ext cx="5939790" cy="1304290"/>
+                      <a:ext cx="6291703" cy="1210046"/>
                     </a:xfrm>
                     <a:prstGeom prst="rect">
                       <a:avLst/>
@@ -2983,7 +2935,7 @@
                 </pic:pic>
               </a:graphicData>
             </a:graphic>
-          </wp:anchor>
+          </wp:inline>
         </w:drawing>
       </w:r>
     </w:p>
@@ -3067,7 +3019,6 @@
           <w:b/>
           <w:sz w:val="36"/>
           <w:szCs w:val="36"/>
-          <w:lang w:val="en-US"/>
         </w:rPr>
       </w:pPr>
       <w:r>
@@ -3076,13 +3027,12 @@
           <w:b/>
           <w:sz w:val="36"/>
           <w:szCs w:val="36"/>
-          <w:lang w:val="en-US"/>
         </w:rPr>
         <w:drawing>
-          <wp:inline distT="0" distB="0" distL="0" distR="0" wp14:anchorId="07809AD7" wp14:editId="01C5836C">
-            <wp:extent cx="5323263" cy="3193730"/>
-            <wp:effectExtent l="0" t="0" r="0" b="6985"/>
-            <wp:docPr id="15" name="Picture 15"/>
+          <wp:inline distT="0" distB="0" distL="0" distR="0" wp14:anchorId="4B27BF4B" wp14:editId="6CF76D9A">
+            <wp:extent cx="5939790" cy="3563620"/>
+            <wp:effectExtent l="0" t="0" r="3810" b="0"/>
+            <wp:docPr id="8" name="Picture 8"/>
             <wp:cNvGraphicFramePr>
               <a:graphicFrameLocks xmlns:a="http://schemas.openxmlformats.org/drawingml/2006/main" noChangeAspect="1"/>
             </wp:cNvGraphicFramePr>
@@ -3102,7 +3052,7 @@
                   <pic:spPr>
                     <a:xfrm>
                       <a:off x="0" y="0"/>
-                      <a:ext cx="5345747" cy="3207219"/>
+                      <a:ext cx="5939790" cy="3563620"/>
                     </a:xfrm>
                     <a:prstGeom prst="rect">
                       <a:avLst/>
@@ -3124,6 +3074,7 @@
           <w:color w:val="666666"/>
           <w:sz w:val="28"/>
           <w:szCs w:val="28"/>
+          <w:lang w:val="en-US"/>
         </w:rPr>
       </w:pPr>
       <w:r>
@@ -3164,7 +3115,28 @@
           <w:sz w:val="28"/>
           <w:szCs w:val="28"/>
         </w:rPr>
-        <w:t>График,полученный в процессе интеграции тригонометрической ветви</w:t>
+        <w:t>График</w:t>
+      </w:r>
+      <w:r>
+        <w:rPr>
+          <w:rFonts w:ascii="Times New Roman" w:eastAsia="Times New Roman" w:hAnsi="Times New Roman" w:cs="Times New Roman"/>
+          <w:i/>
+          <w:color w:val="666666"/>
+          <w:sz w:val="28"/>
+          <w:szCs w:val="28"/>
+        </w:rPr>
+        <w:t xml:space="preserve"> функции </w:t>
+      </w:r>
+      <w:r>
+        <w:rPr>
+          <w:rFonts w:ascii="Times New Roman" w:eastAsia="Times New Roman" w:hAnsi="Times New Roman" w:cs="Times New Roman"/>
+          <w:i/>
+          <w:color w:val="666666"/>
+          <w:sz w:val="28"/>
+          <w:szCs w:val="28"/>
+          <w:lang w:val="en-US"/>
+        </w:rPr>
+        <w:t>sin(x)</w:t>
       </w:r>
     </w:p>
     <w:p>
@@ -3174,6 +3146,7 @@
           <w:b/>
           <w:sz w:val="36"/>
           <w:szCs w:val="36"/>
+          <w:lang w:val="en-US"/>
         </w:rPr>
       </w:pPr>
       <w:r>
@@ -3182,12 +3155,13 @@
           <w:b/>
           <w:sz w:val="36"/>
           <w:szCs w:val="36"/>
+          <w:lang w:val="en-US"/>
         </w:rPr>
         <w:drawing>
-          <wp:inline distT="0" distB="0" distL="0" distR="0" wp14:anchorId="088EDB21" wp14:editId="22D85D06">
-            <wp:extent cx="5323263" cy="3193730"/>
-            <wp:effectExtent l="0" t="0" r="0" b="6985"/>
-            <wp:docPr id="20" name="Picture 20"/>
+          <wp:inline distT="0" distB="0" distL="0" distR="0" wp14:anchorId="576CA974" wp14:editId="033C11E8">
+            <wp:extent cx="5939790" cy="3563620"/>
+            <wp:effectExtent l="0" t="0" r="3810" b="0"/>
+            <wp:docPr id="7" name="Picture 7"/>
             <wp:cNvGraphicFramePr>
               <a:graphicFrameLocks xmlns:a="http://schemas.openxmlformats.org/drawingml/2006/main" noChangeAspect="1"/>
             </wp:cNvGraphicFramePr>
@@ -3207,7 +3181,7 @@
                   <pic:spPr>
                     <a:xfrm>
                       <a:off x="0" y="0"/>
-                      <a:ext cx="5346589" cy="3207724"/>
+                      <a:ext cx="5939790" cy="3563620"/>
                     </a:xfrm>
                     <a:prstGeom prst="rect">
                       <a:avLst/>
@@ -3269,7 +3243,7 @@
           <w:sz w:val="28"/>
           <w:szCs w:val="28"/>
         </w:rPr>
-        <w:t xml:space="preserve">График,полученный в процессе интеграции </w:t>
+        <w:t>График</w:t>
       </w:r>
       <w:r>
         <w:rPr>
@@ -3279,7 +3253,7 @@
           <w:sz w:val="28"/>
           <w:szCs w:val="28"/>
         </w:rPr>
-        <w:t>логарифмической</w:t>
+        <w:t xml:space="preserve"> функции </w:t>
       </w:r>
       <w:r>
         <w:rPr>
@@ -3288,8 +3262,9 @@
           <w:color w:val="666666"/>
           <w:sz w:val="28"/>
           <w:szCs w:val="28"/>
-        </w:rPr>
-        <w:t xml:space="preserve"> </w:t>
+          <w:lang w:val="en-US"/>
+        </w:rPr>
+        <w:t>cos</w:t>
       </w:r>
       <w:r>
         <w:rPr>
@@ -3299,7 +3274,28 @@
           <w:sz w:val="28"/>
           <w:szCs w:val="28"/>
         </w:rPr>
-        <w:t>ветви</w:t>
+        <w:t>(</w:t>
+      </w:r>
+      <w:r>
+        <w:rPr>
+          <w:rFonts w:ascii="Times New Roman" w:eastAsia="Times New Roman" w:hAnsi="Times New Roman" w:cs="Times New Roman"/>
+          <w:i/>
+          <w:color w:val="666666"/>
+          <w:sz w:val="28"/>
+          <w:szCs w:val="28"/>
+          <w:lang w:val="en-US"/>
+        </w:rPr>
+        <w:t>x</w:t>
+      </w:r>
+      <w:r>
+        <w:rPr>
+          <w:rFonts w:ascii="Times New Roman" w:eastAsia="Times New Roman" w:hAnsi="Times New Roman" w:cs="Times New Roman"/>
+          <w:i/>
+          <w:color w:val="666666"/>
+          <w:sz w:val="28"/>
+          <w:szCs w:val="28"/>
+        </w:rPr>
+        <w:t>)</w:t>
       </w:r>
     </w:p>
     <w:p>
@@ -3320,10 +3316,10 @@
         </w:rPr>
         <w:lastRenderedPageBreak/>
         <w:drawing>
-          <wp:inline distT="0" distB="0" distL="0" distR="0" wp14:anchorId="2C1CE8FF" wp14:editId="2BA2BE5A">
+          <wp:inline distT="0" distB="0" distL="0" distR="0" wp14:anchorId="63CAF817" wp14:editId="1165830D">
             <wp:extent cx="5939790" cy="3563620"/>
             <wp:effectExtent l="0" t="0" r="3810" b="0"/>
-            <wp:docPr id="21" name="Picture 21"/>
+            <wp:docPr id="10" name="Picture 10"/>
             <wp:cNvGraphicFramePr>
               <a:graphicFrameLocks xmlns:a="http://schemas.openxmlformats.org/drawingml/2006/main" noChangeAspect="1"/>
             </wp:cNvGraphicFramePr>
@@ -3405,7 +3401,7 @@
           <w:sz w:val="28"/>
           <w:szCs w:val="28"/>
         </w:rPr>
-        <w:t xml:space="preserve">График,полученный в процессе интеграции </w:t>
+        <w:t>График</w:t>
       </w:r>
       <w:r>
         <w:rPr>
@@ -3415,8 +3411,733 @@
           <w:sz w:val="28"/>
           <w:szCs w:val="28"/>
         </w:rPr>
-        <w:t>всей системы</w:t>
-      </w:r>
+        <w:t xml:space="preserve"> функции </w:t>
+      </w:r>
+      <w:r>
+        <w:rPr>
+          <w:rFonts w:ascii="Times New Roman" w:eastAsia="Times New Roman" w:hAnsi="Times New Roman" w:cs="Times New Roman"/>
+          <w:i/>
+          <w:color w:val="666666"/>
+          <w:sz w:val="28"/>
+          <w:szCs w:val="28"/>
+          <w:lang w:val="en-US"/>
+        </w:rPr>
+        <w:t>sec</w:t>
+      </w:r>
+      <w:r>
+        <w:rPr>
+          <w:rFonts w:ascii="Times New Roman" w:eastAsia="Times New Roman" w:hAnsi="Times New Roman" w:cs="Times New Roman"/>
+          <w:i/>
+          <w:color w:val="666666"/>
+          <w:sz w:val="28"/>
+          <w:szCs w:val="28"/>
+        </w:rPr>
+        <w:t>(</w:t>
+      </w:r>
+      <w:r>
+        <w:rPr>
+          <w:rFonts w:ascii="Times New Roman" w:eastAsia="Times New Roman" w:hAnsi="Times New Roman" w:cs="Times New Roman"/>
+          <w:i/>
+          <w:color w:val="666666"/>
+          <w:sz w:val="28"/>
+          <w:szCs w:val="28"/>
+          <w:lang w:val="en-US"/>
+        </w:rPr>
+        <w:t>x</w:t>
+      </w:r>
+      <w:r>
+        <w:rPr>
+          <w:rFonts w:ascii="Times New Roman" w:eastAsia="Times New Roman" w:hAnsi="Times New Roman" w:cs="Times New Roman"/>
+          <w:i/>
+          <w:color w:val="666666"/>
+          <w:sz w:val="28"/>
+          <w:szCs w:val="28"/>
+        </w:rPr>
+        <w:t>)</w:t>
+      </w:r>
+    </w:p>
+    <w:p>
+      <w:pPr>
+        <w:rPr>
+          <w:rFonts w:ascii="Times New Roman" w:eastAsia="Times New Roman" w:hAnsi="Times New Roman" w:cs="Times New Roman"/>
+          <w:b/>
+          <w:sz w:val="36"/>
+          <w:szCs w:val="36"/>
+        </w:rPr>
+      </w:pPr>
+      <w:r>
+        <w:rPr>
+          <w:rFonts w:ascii="Times New Roman" w:eastAsia="Times New Roman" w:hAnsi="Times New Roman" w:cs="Times New Roman"/>
+          <w:b/>
+          <w:sz w:val="36"/>
+          <w:szCs w:val="36"/>
+        </w:rPr>
+        <w:drawing>
+          <wp:inline distT="0" distB="0" distL="0" distR="0" wp14:anchorId="4918A882" wp14:editId="1FC93BE2">
+            <wp:extent cx="5939790" cy="3563620"/>
+            <wp:effectExtent l="0" t="0" r="3810" b="0"/>
+            <wp:docPr id="11" name="Picture 11"/>
+            <wp:cNvGraphicFramePr>
+              <a:graphicFrameLocks xmlns:a="http://schemas.openxmlformats.org/drawingml/2006/main" noChangeAspect="1"/>
+            </wp:cNvGraphicFramePr>
+            <a:graphic xmlns:a="http://schemas.openxmlformats.org/drawingml/2006/main">
+              <a:graphicData uri="http://schemas.openxmlformats.org/drawingml/2006/picture">
+                <pic:pic xmlns:pic="http://schemas.openxmlformats.org/drawingml/2006/picture">
+                  <pic:nvPicPr>
+                    <pic:cNvPr id="1" name=""/>
+                    <pic:cNvPicPr/>
+                  </pic:nvPicPr>
+                  <pic:blipFill>
+                    <a:blip r:embed="rId17"/>
+                    <a:stretch>
+                      <a:fillRect/>
+                    </a:stretch>
+                  </pic:blipFill>
+                  <pic:spPr>
+                    <a:xfrm>
+                      <a:off x="0" y="0"/>
+                      <a:ext cx="5939790" cy="3563620"/>
+                    </a:xfrm>
+                    <a:prstGeom prst="rect">
+                      <a:avLst/>
+                    </a:prstGeom>
+                  </pic:spPr>
+                </pic:pic>
+              </a:graphicData>
+            </a:graphic>
+          </wp:inline>
+        </w:drawing>
+      </w:r>
+    </w:p>
+    <w:p>
+      <w:pPr>
+        <w:jc w:val="center"/>
+        <w:rPr>
+          <w:rFonts w:ascii="Times New Roman" w:eastAsia="Times New Roman" w:hAnsi="Times New Roman" w:cs="Times New Roman"/>
+          <w:i/>
+          <w:color w:val="666666"/>
+          <w:sz w:val="28"/>
+          <w:szCs w:val="28"/>
+        </w:rPr>
+      </w:pPr>
+      <w:r>
+        <w:rPr>
+          <w:rFonts w:ascii="Times New Roman" w:eastAsia="Times New Roman" w:hAnsi="Times New Roman" w:cs="Times New Roman"/>
+          <w:i/>
+          <w:color w:val="666666"/>
+          <w:sz w:val="28"/>
+          <w:szCs w:val="28"/>
+        </w:rPr>
+        <w:t xml:space="preserve">Рисунок </w:t>
+      </w:r>
+      <w:r>
+        <w:rPr>
+          <w:rFonts w:ascii="Times New Roman" w:eastAsia="Times New Roman" w:hAnsi="Times New Roman" w:cs="Times New Roman"/>
+          <w:i/>
+          <w:color w:val="666666"/>
+          <w:sz w:val="28"/>
+          <w:szCs w:val="28"/>
+        </w:rPr>
+        <w:t>6</w:t>
+      </w:r>
+      <w:r>
+        <w:rPr>
+          <w:rFonts w:ascii="Times New Roman" w:eastAsia="Times New Roman" w:hAnsi="Times New Roman" w:cs="Times New Roman"/>
+          <w:i/>
+          <w:color w:val="666666"/>
+          <w:sz w:val="28"/>
+          <w:szCs w:val="28"/>
+        </w:rPr>
+        <w:t xml:space="preserve">. </w:t>
+      </w:r>
+      <w:r>
+        <w:rPr>
+          <w:rFonts w:ascii="Times New Roman" w:eastAsia="Times New Roman" w:hAnsi="Times New Roman" w:cs="Times New Roman"/>
+          <w:i/>
+          <w:color w:val="666666"/>
+          <w:sz w:val="28"/>
+          <w:szCs w:val="28"/>
+        </w:rPr>
+        <w:t>График</w:t>
+      </w:r>
+      <w:r>
+        <w:rPr>
+          <w:rFonts w:ascii="Times New Roman" w:eastAsia="Times New Roman" w:hAnsi="Times New Roman" w:cs="Times New Roman"/>
+          <w:i/>
+          <w:color w:val="666666"/>
+          <w:sz w:val="28"/>
+          <w:szCs w:val="28"/>
+        </w:rPr>
+        <w:t xml:space="preserve"> функции </w:t>
+      </w:r>
+      <w:r>
+        <w:rPr>
+          <w:rFonts w:ascii="Times New Roman" w:eastAsia="Times New Roman" w:hAnsi="Times New Roman" w:cs="Times New Roman"/>
+          <w:i/>
+          <w:color w:val="666666"/>
+          <w:sz w:val="28"/>
+          <w:szCs w:val="28"/>
+          <w:lang w:val="en-US"/>
+        </w:rPr>
+        <w:t>ta</w:t>
+      </w:r>
+      <w:r>
+        <w:rPr>
+          <w:rFonts w:ascii="Times New Roman" w:eastAsia="Times New Roman" w:hAnsi="Times New Roman" w:cs="Times New Roman"/>
+          <w:i/>
+          <w:color w:val="666666"/>
+          <w:sz w:val="28"/>
+          <w:szCs w:val="28"/>
+          <w:lang w:val="en-US"/>
+        </w:rPr>
+        <w:t>n</w:t>
+      </w:r>
+      <w:r>
+        <w:rPr>
+          <w:rFonts w:ascii="Times New Roman" w:eastAsia="Times New Roman" w:hAnsi="Times New Roman" w:cs="Times New Roman"/>
+          <w:i/>
+          <w:color w:val="666666"/>
+          <w:sz w:val="28"/>
+          <w:szCs w:val="28"/>
+        </w:rPr>
+        <w:t>(</w:t>
+      </w:r>
+      <w:r>
+        <w:rPr>
+          <w:rFonts w:ascii="Times New Roman" w:eastAsia="Times New Roman" w:hAnsi="Times New Roman" w:cs="Times New Roman"/>
+          <w:i/>
+          <w:color w:val="666666"/>
+          <w:sz w:val="28"/>
+          <w:szCs w:val="28"/>
+          <w:lang w:val="en-US"/>
+        </w:rPr>
+        <w:t>x</w:t>
+      </w:r>
+      <w:r>
+        <w:rPr>
+          <w:rFonts w:ascii="Times New Roman" w:eastAsia="Times New Roman" w:hAnsi="Times New Roman" w:cs="Times New Roman"/>
+          <w:i/>
+          <w:color w:val="666666"/>
+          <w:sz w:val="28"/>
+          <w:szCs w:val="28"/>
+        </w:rPr>
+        <w:t>)</w:t>
+      </w:r>
+    </w:p>
+    <w:p>
+      <w:pPr>
+        <w:rPr>
+          <w:rFonts w:ascii="Times New Roman" w:eastAsia="Times New Roman" w:hAnsi="Times New Roman" w:cs="Times New Roman"/>
+          <w:b/>
+          <w:sz w:val="36"/>
+          <w:szCs w:val="36"/>
+        </w:rPr>
+      </w:pPr>
+    </w:p>
+    <w:p>
+      <w:pPr>
+        <w:rPr>
+          <w:rFonts w:ascii="Times New Roman" w:eastAsia="Times New Roman" w:hAnsi="Times New Roman" w:cs="Times New Roman"/>
+          <w:b/>
+          <w:sz w:val="36"/>
+          <w:szCs w:val="36"/>
+        </w:rPr>
+      </w:pPr>
+      <w:r>
+        <w:rPr>
+          <w:rFonts w:ascii="Times New Roman" w:eastAsia="Times New Roman" w:hAnsi="Times New Roman" w:cs="Times New Roman"/>
+          <w:b/>
+          <w:sz w:val="36"/>
+          <w:szCs w:val="36"/>
+        </w:rPr>
+        <w:lastRenderedPageBreak/>
+        <w:drawing>
+          <wp:inline distT="0" distB="0" distL="0" distR="0" wp14:anchorId="73311CF5" wp14:editId="114422B9">
+            <wp:extent cx="5939790" cy="3563620"/>
+            <wp:effectExtent l="0" t="0" r="3810" b="0"/>
+            <wp:docPr id="12" name="Picture 12"/>
+            <wp:cNvGraphicFramePr>
+              <a:graphicFrameLocks xmlns:a="http://schemas.openxmlformats.org/drawingml/2006/main" noChangeAspect="1"/>
+            </wp:cNvGraphicFramePr>
+            <a:graphic xmlns:a="http://schemas.openxmlformats.org/drawingml/2006/main">
+              <a:graphicData uri="http://schemas.openxmlformats.org/drawingml/2006/picture">
+                <pic:pic xmlns:pic="http://schemas.openxmlformats.org/drawingml/2006/picture">
+                  <pic:nvPicPr>
+                    <pic:cNvPr id="1" name=""/>
+                    <pic:cNvPicPr/>
+                  </pic:nvPicPr>
+                  <pic:blipFill>
+                    <a:blip r:embed="rId18"/>
+                    <a:stretch>
+                      <a:fillRect/>
+                    </a:stretch>
+                  </pic:blipFill>
+                  <pic:spPr>
+                    <a:xfrm>
+                      <a:off x="0" y="0"/>
+                      <a:ext cx="5939790" cy="3563620"/>
+                    </a:xfrm>
+                    <a:prstGeom prst="rect">
+                      <a:avLst/>
+                    </a:prstGeom>
+                  </pic:spPr>
+                </pic:pic>
+              </a:graphicData>
+            </a:graphic>
+          </wp:inline>
+        </w:drawing>
+      </w:r>
+    </w:p>
+    <w:p>
+      <w:pPr>
+        <w:jc w:val="center"/>
+        <w:rPr>
+          <w:rFonts w:ascii="Times New Roman" w:eastAsia="Times New Roman" w:hAnsi="Times New Roman" w:cs="Times New Roman"/>
+          <w:i/>
+          <w:color w:val="666666"/>
+          <w:sz w:val="28"/>
+          <w:szCs w:val="28"/>
+        </w:rPr>
+      </w:pPr>
+      <w:r>
+        <w:rPr>
+          <w:rFonts w:ascii="Times New Roman" w:eastAsia="Times New Roman" w:hAnsi="Times New Roman" w:cs="Times New Roman"/>
+          <w:i/>
+          <w:color w:val="666666"/>
+          <w:sz w:val="28"/>
+          <w:szCs w:val="28"/>
+        </w:rPr>
+        <w:t xml:space="preserve">Рисунок </w:t>
+      </w:r>
+      <w:r>
+        <w:rPr>
+          <w:rFonts w:ascii="Times New Roman" w:eastAsia="Times New Roman" w:hAnsi="Times New Roman" w:cs="Times New Roman"/>
+          <w:i/>
+          <w:color w:val="666666"/>
+          <w:sz w:val="28"/>
+          <w:szCs w:val="28"/>
+        </w:rPr>
+        <w:t>7</w:t>
+      </w:r>
+      <w:r>
+        <w:rPr>
+          <w:rFonts w:ascii="Times New Roman" w:eastAsia="Times New Roman" w:hAnsi="Times New Roman" w:cs="Times New Roman"/>
+          <w:i/>
+          <w:color w:val="666666"/>
+          <w:sz w:val="28"/>
+          <w:szCs w:val="28"/>
+        </w:rPr>
+        <w:t xml:space="preserve">. </w:t>
+      </w:r>
+      <w:r>
+        <w:rPr>
+          <w:rFonts w:ascii="Times New Roman" w:eastAsia="Times New Roman" w:hAnsi="Times New Roman" w:cs="Times New Roman"/>
+          <w:i/>
+          <w:color w:val="666666"/>
+          <w:sz w:val="28"/>
+          <w:szCs w:val="28"/>
+        </w:rPr>
+        <w:t>График</w:t>
+      </w:r>
+      <w:r>
+        <w:rPr>
+          <w:rFonts w:ascii="Times New Roman" w:eastAsia="Times New Roman" w:hAnsi="Times New Roman" w:cs="Times New Roman"/>
+          <w:i/>
+          <w:color w:val="666666"/>
+          <w:sz w:val="28"/>
+          <w:szCs w:val="28"/>
+        </w:rPr>
+        <w:t xml:space="preserve"> функции </w:t>
+      </w:r>
+      <w:r>
+        <w:rPr>
+          <w:rFonts w:ascii="Times New Roman" w:eastAsia="Times New Roman" w:hAnsi="Times New Roman" w:cs="Times New Roman"/>
+          <w:i/>
+          <w:color w:val="666666"/>
+          <w:sz w:val="28"/>
+          <w:szCs w:val="28"/>
+          <w:lang w:val="en-US"/>
+        </w:rPr>
+        <w:t>ln</w:t>
+      </w:r>
+      <w:r>
+        <w:rPr>
+          <w:rFonts w:ascii="Times New Roman" w:eastAsia="Times New Roman" w:hAnsi="Times New Roman" w:cs="Times New Roman"/>
+          <w:i/>
+          <w:color w:val="666666"/>
+          <w:sz w:val="28"/>
+          <w:szCs w:val="28"/>
+        </w:rPr>
+        <w:t>(</w:t>
+      </w:r>
+      <w:r>
+        <w:rPr>
+          <w:rFonts w:ascii="Times New Roman" w:eastAsia="Times New Roman" w:hAnsi="Times New Roman" w:cs="Times New Roman"/>
+          <w:i/>
+          <w:color w:val="666666"/>
+          <w:sz w:val="28"/>
+          <w:szCs w:val="28"/>
+          <w:lang w:val="en-US"/>
+        </w:rPr>
+        <w:t>x</w:t>
+      </w:r>
+      <w:r>
+        <w:rPr>
+          <w:rFonts w:ascii="Times New Roman" w:eastAsia="Times New Roman" w:hAnsi="Times New Roman" w:cs="Times New Roman"/>
+          <w:i/>
+          <w:color w:val="666666"/>
+          <w:sz w:val="28"/>
+          <w:szCs w:val="28"/>
+        </w:rPr>
+        <w:t>)</w:t>
+      </w:r>
+    </w:p>
+    <w:p>
+      <w:pPr>
+        <w:jc w:val="center"/>
+        <w:rPr>
+          <w:rFonts w:ascii="Times New Roman" w:eastAsia="Times New Roman" w:hAnsi="Times New Roman" w:cs="Times New Roman"/>
+          <w:i/>
+          <w:color w:val="666666"/>
+          <w:sz w:val="28"/>
+          <w:szCs w:val="28"/>
+        </w:rPr>
+      </w:pPr>
+      <w:r>
+        <w:rPr>
+          <w:rFonts w:ascii="Times New Roman" w:eastAsia="Times New Roman" w:hAnsi="Times New Roman" w:cs="Times New Roman"/>
+          <w:i/>
+          <w:color w:val="666666"/>
+          <w:sz w:val="28"/>
+          <w:szCs w:val="28"/>
+        </w:rPr>
+        <w:drawing>
+          <wp:inline distT="0" distB="0" distL="0" distR="0" wp14:anchorId="5C2210AA" wp14:editId="6B79D6D7">
+            <wp:extent cx="5939790" cy="3563620"/>
+            <wp:effectExtent l="0" t="0" r="3810" b="0"/>
+            <wp:docPr id="16" name="Picture 16"/>
+            <wp:cNvGraphicFramePr>
+              <a:graphicFrameLocks xmlns:a="http://schemas.openxmlformats.org/drawingml/2006/main" noChangeAspect="1"/>
+            </wp:cNvGraphicFramePr>
+            <a:graphic xmlns:a="http://schemas.openxmlformats.org/drawingml/2006/main">
+              <a:graphicData uri="http://schemas.openxmlformats.org/drawingml/2006/picture">
+                <pic:pic xmlns:pic="http://schemas.openxmlformats.org/drawingml/2006/picture">
+                  <pic:nvPicPr>
+                    <pic:cNvPr id="1" name=""/>
+                    <pic:cNvPicPr/>
+                  </pic:nvPicPr>
+                  <pic:blipFill>
+                    <a:blip r:embed="rId19"/>
+                    <a:stretch>
+                      <a:fillRect/>
+                    </a:stretch>
+                  </pic:blipFill>
+                  <pic:spPr>
+                    <a:xfrm>
+                      <a:off x="0" y="0"/>
+                      <a:ext cx="5939790" cy="3563620"/>
+                    </a:xfrm>
+                    <a:prstGeom prst="rect">
+                      <a:avLst/>
+                    </a:prstGeom>
+                  </pic:spPr>
+                </pic:pic>
+              </a:graphicData>
+            </a:graphic>
+          </wp:inline>
+        </w:drawing>
+      </w:r>
+    </w:p>
+    <w:p>
+      <w:pPr>
+        <w:jc w:val="center"/>
+        <w:rPr>
+          <w:rFonts w:ascii="Times New Roman" w:eastAsia="Times New Roman" w:hAnsi="Times New Roman" w:cs="Times New Roman"/>
+          <w:i/>
+          <w:color w:val="666666"/>
+          <w:sz w:val="28"/>
+          <w:szCs w:val="28"/>
+        </w:rPr>
+      </w:pPr>
+      <w:r>
+        <w:rPr>
+          <w:rFonts w:ascii="Times New Roman" w:eastAsia="Times New Roman" w:hAnsi="Times New Roman" w:cs="Times New Roman"/>
+          <w:i/>
+          <w:color w:val="666666"/>
+          <w:sz w:val="28"/>
+          <w:szCs w:val="28"/>
+        </w:rPr>
+        <w:t xml:space="preserve">Рисунок </w:t>
+      </w:r>
+      <w:r>
+        <w:rPr>
+          <w:rFonts w:ascii="Times New Roman" w:eastAsia="Times New Roman" w:hAnsi="Times New Roman" w:cs="Times New Roman"/>
+          <w:i/>
+          <w:color w:val="666666"/>
+          <w:sz w:val="28"/>
+          <w:szCs w:val="28"/>
+        </w:rPr>
+        <w:t>8</w:t>
+      </w:r>
+      <w:r>
+        <w:rPr>
+          <w:rFonts w:ascii="Times New Roman" w:eastAsia="Times New Roman" w:hAnsi="Times New Roman" w:cs="Times New Roman"/>
+          <w:i/>
+          <w:color w:val="666666"/>
+          <w:sz w:val="28"/>
+          <w:szCs w:val="28"/>
+        </w:rPr>
+        <w:t xml:space="preserve">. </w:t>
+      </w:r>
+      <w:r>
+        <w:rPr>
+          <w:rFonts w:ascii="Times New Roman" w:eastAsia="Times New Roman" w:hAnsi="Times New Roman" w:cs="Times New Roman"/>
+          <w:i/>
+          <w:color w:val="666666"/>
+          <w:sz w:val="28"/>
+          <w:szCs w:val="28"/>
+        </w:rPr>
+        <w:t>График</w:t>
+      </w:r>
+      <w:r>
+        <w:rPr>
+          <w:rFonts w:ascii="Times New Roman" w:eastAsia="Times New Roman" w:hAnsi="Times New Roman" w:cs="Times New Roman"/>
+          <w:i/>
+          <w:color w:val="666666"/>
+          <w:sz w:val="28"/>
+          <w:szCs w:val="28"/>
+        </w:rPr>
+        <w:t xml:space="preserve"> функции </w:t>
+      </w:r>
+      <w:r>
+        <w:rPr>
+          <w:rFonts w:ascii="Times New Roman" w:eastAsia="Times New Roman" w:hAnsi="Times New Roman" w:cs="Times New Roman"/>
+          <w:i/>
+          <w:color w:val="666666"/>
+          <w:sz w:val="28"/>
+          <w:szCs w:val="28"/>
+          <w:lang w:val="en-US"/>
+        </w:rPr>
+        <w:t>log</w:t>
+      </w:r>
+      <w:r>
+        <w:rPr>
+          <w:rFonts w:ascii="Times New Roman" w:eastAsia="Times New Roman" w:hAnsi="Times New Roman" w:cs="Times New Roman"/>
+          <w:i/>
+          <w:color w:val="666666"/>
+          <w:sz w:val="28"/>
+          <w:szCs w:val="28"/>
+        </w:rPr>
+        <w:t>2</w:t>
+      </w:r>
+      <w:r>
+        <w:rPr>
+          <w:rFonts w:ascii="Times New Roman" w:eastAsia="Times New Roman" w:hAnsi="Times New Roman" w:cs="Times New Roman"/>
+          <w:i/>
+          <w:color w:val="666666"/>
+          <w:sz w:val="28"/>
+          <w:szCs w:val="28"/>
+        </w:rPr>
+        <w:t>(</w:t>
+      </w:r>
+      <w:r>
+        <w:rPr>
+          <w:rFonts w:ascii="Times New Roman" w:eastAsia="Times New Roman" w:hAnsi="Times New Roman" w:cs="Times New Roman"/>
+          <w:i/>
+          <w:color w:val="666666"/>
+          <w:sz w:val="28"/>
+          <w:szCs w:val="28"/>
+          <w:lang w:val="en-US"/>
+        </w:rPr>
+        <w:t>x</w:t>
+      </w:r>
+      <w:r>
+        <w:rPr>
+          <w:rFonts w:ascii="Times New Roman" w:eastAsia="Times New Roman" w:hAnsi="Times New Roman" w:cs="Times New Roman"/>
+          <w:i/>
+          <w:color w:val="666666"/>
+          <w:sz w:val="28"/>
+          <w:szCs w:val="28"/>
+        </w:rPr>
+        <w:t>)</w:t>
+      </w:r>
+    </w:p>
+    <w:p>
+      <w:pPr>
+        <w:rPr>
+          <w:rFonts w:ascii="Times New Roman" w:eastAsia="Times New Roman" w:hAnsi="Times New Roman" w:cs="Times New Roman"/>
+          <w:b/>
+          <w:sz w:val="36"/>
+          <w:szCs w:val="36"/>
+        </w:rPr>
+      </w:pPr>
+    </w:p>
+    <w:p>
+      <w:pPr>
+        <w:rPr>
+          <w:rFonts w:ascii="Times New Roman" w:eastAsia="Times New Roman" w:hAnsi="Times New Roman" w:cs="Times New Roman"/>
+          <w:b/>
+          <w:sz w:val="36"/>
+          <w:szCs w:val="36"/>
+        </w:rPr>
+      </w:pPr>
+      <w:r>
+        <w:rPr>
+          <w:rFonts w:ascii="Times New Roman" w:eastAsia="Times New Roman" w:hAnsi="Times New Roman" w:cs="Times New Roman"/>
+          <w:b/>
+          <w:sz w:val="36"/>
+          <w:szCs w:val="36"/>
+        </w:rPr>
+        <w:lastRenderedPageBreak/>
+        <w:drawing>
+          <wp:inline distT="0" distB="0" distL="0" distR="0" wp14:anchorId="64964F98" wp14:editId="545A5AE1">
+            <wp:extent cx="5939790" cy="3563620"/>
+            <wp:effectExtent l="0" t="0" r="3810" b="0"/>
+            <wp:docPr id="14" name="Picture 14"/>
+            <wp:cNvGraphicFramePr>
+              <a:graphicFrameLocks xmlns:a="http://schemas.openxmlformats.org/drawingml/2006/main" noChangeAspect="1"/>
+            </wp:cNvGraphicFramePr>
+            <a:graphic xmlns:a="http://schemas.openxmlformats.org/drawingml/2006/main">
+              <a:graphicData uri="http://schemas.openxmlformats.org/drawingml/2006/picture">
+                <pic:pic xmlns:pic="http://schemas.openxmlformats.org/drawingml/2006/picture">
+                  <pic:nvPicPr>
+                    <pic:cNvPr id="1" name=""/>
+                    <pic:cNvPicPr/>
+                  </pic:nvPicPr>
+                  <pic:blipFill>
+                    <a:blip r:embed="rId20"/>
+                    <a:stretch>
+                      <a:fillRect/>
+                    </a:stretch>
+                  </pic:blipFill>
+                  <pic:spPr>
+                    <a:xfrm>
+                      <a:off x="0" y="0"/>
+                      <a:ext cx="5939790" cy="3563620"/>
+                    </a:xfrm>
+                    <a:prstGeom prst="rect">
+                      <a:avLst/>
+                    </a:prstGeom>
+                  </pic:spPr>
+                </pic:pic>
+              </a:graphicData>
+            </a:graphic>
+          </wp:inline>
+        </w:drawing>
+      </w:r>
+    </w:p>
+    <w:p>
+      <w:pPr>
+        <w:jc w:val="center"/>
+        <w:rPr>
+          <w:rFonts w:ascii="Times New Roman" w:eastAsia="Times New Roman" w:hAnsi="Times New Roman" w:cs="Times New Roman"/>
+          <w:i/>
+          <w:color w:val="666666"/>
+          <w:sz w:val="28"/>
+          <w:szCs w:val="28"/>
+        </w:rPr>
+      </w:pPr>
+      <w:r>
+        <w:rPr>
+          <w:rFonts w:ascii="Times New Roman" w:eastAsia="Times New Roman" w:hAnsi="Times New Roman" w:cs="Times New Roman"/>
+          <w:i/>
+          <w:color w:val="666666"/>
+          <w:sz w:val="28"/>
+          <w:szCs w:val="28"/>
+        </w:rPr>
+        <w:t xml:space="preserve">Рисунок </w:t>
+      </w:r>
+      <w:r>
+        <w:rPr>
+          <w:rFonts w:ascii="Times New Roman" w:eastAsia="Times New Roman" w:hAnsi="Times New Roman" w:cs="Times New Roman"/>
+          <w:i/>
+          <w:color w:val="666666"/>
+          <w:sz w:val="28"/>
+          <w:szCs w:val="28"/>
+        </w:rPr>
+        <w:t>9</w:t>
+      </w:r>
+      <w:r>
+        <w:rPr>
+          <w:rFonts w:ascii="Times New Roman" w:eastAsia="Times New Roman" w:hAnsi="Times New Roman" w:cs="Times New Roman"/>
+          <w:i/>
+          <w:color w:val="666666"/>
+          <w:sz w:val="28"/>
+          <w:szCs w:val="28"/>
+        </w:rPr>
+        <w:t xml:space="preserve">. </w:t>
+      </w:r>
+      <w:r>
+        <w:rPr>
+          <w:rFonts w:ascii="Times New Roman" w:eastAsia="Times New Roman" w:hAnsi="Times New Roman" w:cs="Times New Roman"/>
+          <w:i/>
+          <w:color w:val="666666"/>
+          <w:sz w:val="28"/>
+          <w:szCs w:val="28"/>
+        </w:rPr>
+        <w:t>График</w:t>
+      </w:r>
+      <w:r>
+        <w:rPr>
+          <w:rFonts w:ascii="Times New Roman" w:eastAsia="Times New Roman" w:hAnsi="Times New Roman" w:cs="Times New Roman"/>
+          <w:i/>
+          <w:color w:val="666666"/>
+          <w:sz w:val="28"/>
+          <w:szCs w:val="28"/>
+        </w:rPr>
+        <w:t xml:space="preserve"> </w:t>
+      </w:r>
+      <w:r>
+        <w:rPr>
+          <w:rFonts w:ascii="Times New Roman" w:eastAsia="Times New Roman" w:hAnsi="Times New Roman" w:cs="Times New Roman"/>
+          <w:i/>
+          <w:color w:val="666666"/>
+          <w:sz w:val="28"/>
+          <w:szCs w:val="28"/>
+        </w:rPr>
+        <w:t xml:space="preserve">системы функции </w:t>
+      </w:r>
+      <w:r>
+        <w:rPr>
+          <w:rFonts w:ascii="Times New Roman" w:eastAsia="Times New Roman" w:hAnsi="Times New Roman" w:cs="Times New Roman"/>
+          <w:i/>
+          <w:color w:val="666666"/>
+          <w:sz w:val="28"/>
+          <w:szCs w:val="28"/>
+        </w:rPr>
+        <w:t>(</w:t>
+      </w:r>
+      <w:r>
+        <w:rPr>
+          <w:rFonts w:ascii="Times New Roman" w:eastAsia="Times New Roman" w:hAnsi="Times New Roman" w:cs="Times New Roman"/>
+          <w:i/>
+          <w:color w:val="666666"/>
+          <w:sz w:val="28"/>
+          <w:szCs w:val="28"/>
+          <w:lang w:val="en-US"/>
+        </w:rPr>
+        <w:t>x</w:t>
+      </w:r>
+      <w:r>
+        <w:rPr>
+          <w:rFonts w:ascii="Times New Roman" w:eastAsia="Times New Roman" w:hAnsi="Times New Roman" w:cs="Times New Roman"/>
+          <w:i/>
+          <w:color w:val="666666"/>
+          <w:sz w:val="28"/>
+          <w:szCs w:val="28"/>
+        </w:rPr>
+        <w:t>)</w:t>
+      </w:r>
+    </w:p>
+    <w:p>
+      <w:pPr>
+        <w:rPr>
+          <w:rFonts w:ascii="Times New Roman" w:eastAsia="Times New Roman" w:hAnsi="Times New Roman" w:cs="Times New Roman"/>
+          <w:b/>
+          <w:sz w:val="36"/>
+          <w:szCs w:val="36"/>
+        </w:rPr>
+      </w:pPr>
     </w:p>
     <w:p>
       <w:pPr>
@@ -3452,7 +4173,7 @@
                     <pic:cNvPicPr/>
                   </pic:nvPicPr>
                   <pic:blipFill>
-                    <a:blip r:embed="rId17">
+                    <a:blip r:embed="rId21">
                       <a:extLst>
                         <a:ext uri="{28A0092B-C50C-407E-A947-70E740481C1C}">
                           <a14:useLocalDpi xmlns:a14="http://schemas.microsoft.com/office/drawing/2010/main" val="0"/>
@@ -3498,17 +4219,7 @@
           <w:sz w:val="28"/>
           <w:szCs w:val="28"/>
         </w:rPr>
-        <w:t xml:space="preserve">Рисунок </w:t>
-      </w:r>
-      <w:r>
-        <w:rPr>
-          <w:rFonts w:ascii="Times New Roman" w:eastAsia="Times New Roman" w:hAnsi="Times New Roman" w:cs="Times New Roman"/>
-          <w:i/>
-          <w:color w:val="666666"/>
-          <w:sz w:val="28"/>
-          <w:szCs w:val="28"/>
-        </w:rPr>
-        <w:t>6</w:t>
+        <w:t>Рисунок 10</w:t>
       </w:r>
       <w:r>
         <w:rPr>
@@ -3593,16 +4304,18 @@
           <w:szCs w:val="36"/>
         </w:rPr>
       </w:pPr>
-    </w:p>
-    <w:p>
-      <w:pPr>
+      <w:r>
         <w:rPr>
           <w:rFonts w:ascii="Times New Roman" w:eastAsia="Times New Roman" w:hAnsi="Times New Roman" w:cs="Times New Roman"/>
           <w:b/>
           <w:sz w:val="36"/>
           <w:szCs w:val="36"/>
         </w:rPr>
-      </w:pPr>
+        <w:lastRenderedPageBreak/>
+        <w:t>Выво</w:t>
+      </w:r>
+      <w:bookmarkStart w:id="0" w:name="_GoBack"/>
+      <w:bookmarkEnd w:id="0"/>
       <w:r>
         <w:rPr>
           <w:rFonts w:ascii="Times New Roman" w:eastAsia="Times New Roman" w:hAnsi="Times New Roman" w:cs="Times New Roman"/>
@@ -3610,29 +4323,18 @@
           <w:sz w:val="36"/>
           <w:szCs w:val="36"/>
         </w:rPr>
-        <w:lastRenderedPageBreak/>
-        <w:t>Выводы</w:t>
-      </w:r>
-    </w:p>
-    <w:p>
-      <w:pPr>
-        <w:rPr>
-          <w:rFonts w:ascii="Times New Roman" w:eastAsia="Times New Roman" w:hAnsi="Times New Roman" w:cs="Times New Roman"/>
-          <w:sz w:val="28"/>
-          <w:szCs w:val="28"/>
-        </w:rPr>
-      </w:pPr>
-      <w:bookmarkStart w:id="0" w:name="_gjdgxs" w:colFirst="0" w:colLast="0"/>
-      <w:bookmarkEnd w:id="0"/>
-      <w:r>
-        <w:rPr>
-          <w:rFonts w:ascii="Times New Roman" w:eastAsia="Times New Roman" w:hAnsi="Times New Roman" w:cs="Times New Roman"/>
-          <w:sz w:val="28"/>
-          <w:szCs w:val="28"/>
-        </w:rPr>
-        <w:t>В ходе выполнения лабораторной работы была реализована система функций на основе базовых модулей sin(x) и ln(x), а также производных тригонометрических и логарифмических функций. Для программы были разработаны модульные и интегр</w:t>
-      </w:r>
-      <w:bookmarkStart w:id="1" w:name="_GoBack"/>
+        <w:t>ды</w:t>
+      </w:r>
+    </w:p>
+    <w:p>
+      <w:pPr>
+        <w:rPr>
+          <w:rFonts w:ascii="Times New Roman" w:eastAsia="Times New Roman" w:hAnsi="Times New Roman" w:cs="Times New Roman"/>
+          <w:sz w:val="28"/>
+          <w:szCs w:val="28"/>
+        </w:rPr>
+      </w:pPr>
+      <w:bookmarkStart w:id="1" w:name="_gjdgxs" w:colFirst="0" w:colLast="0"/>
       <w:bookmarkEnd w:id="1"/>
       <w:r>
         <w:rPr>
@@ -3640,11 +4342,11 @@
           <w:sz w:val="28"/>
           <w:szCs w:val="28"/>
         </w:rPr>
-        <w:t>ационные тесты, использованы табличные заглушки и выполнен анализ областей допустимых значений. Также были получены CSV-выгрузки и построены графики на этапах интеграции приложения. В результате была подтверждена корректность работы отдельных модулей и всей системы функций в целом.</w:t>
+        <w:t>В ходе выполнения лабораторной работы была реализована система функций на основе базовых модулей sin(x) и ln(x), а также производных тригонометрических и логарифмических функций. Для программы были разработаны модульные и интеграционные тесты, использованы табличные заглушки и выполнен анализ областей допустимых значений. Также были получены CSV-выгрузки и построены графики на этапах интеграции приложения. В результате была подтверждена корректность работы отдельных модулей и всей системы функций в целом.</w:t>
       </w:r>
     </w:p>
     <w:sectPr>
-      <w:headerReference w:type="default" r:id="rId18"/>
+      <w:headerReference w:type="default" r:id="rId22"/>
       <w:pgSz w:w="11906" w:h="16838"/>
       <w:pgMar w:top="1134" w:right="851" w:bottom="567" w:left="1701" w:header="709" w:footer="709" w:gutter="0"/>
       <w:pgNumType w:start="1"/>
@@ -8963,7 +9665,7 @@
   </w:latentStyles>
   <w:style w:type="paragraph" w:default="1" w:styleId="Normal">
     <w:name w:val="Normal"/>
-    <w:rsid w:val="00B675B8"/>
+    <w:rsid w:val="00C26618"/>
   </w:style>
   <w:style w:type="paragraph" w:styleId="Heading1">
     <w:name w:val="heading 1"/>
@@ -9062,6 +9764,7 @@
   <w:style w:type="character" w:default="1" w:styleId="DefaultParagraphFont">
     <w:name w:val="Default Paragraph Font"/>
     <w:uiPriority w:val="1"/>
+    <w:semiHidden/>
     <w:unhideWhenUsed/>
   </w:style>
   <w:style w:type="table" w:default="1" w:styleId="TableNormal">

</xml_diff>